<commit_message>
doc: add Implementation Class Diagram and comparison table
</commit_message>
<xml_diff>
--- a/document/hw5.docx
+++ b/document/hw5.docx
@@ -12214,8 +12214,8 @@
           <w:noProof/>
         </w:rPr>
         <w:drawing>
-          <wp:inline distT="0" distB="0" distL="0" distR="0" wp14:anchorId="7E376277" wp14:editId="69FBE367">
-            <wp:extent cx="5274310" cy="5645785"/>
+          <wp:inline distT="0" distB="0" distL="0" distR="0" wp14:anchorId="4324B0A7" wp14:editId="2375D333">
+            <wp:extent cx="5274310" cy="5641975"/>
             <wp:effectExtent l="0" t="0" r="2540" b="0"/>
             <wp:docPr id="1" name="圖片 1"/>
             <wp:cNvGraphicFramePr>
@@ -12246,7 +12246,7 @@
                   <pic:spPr bwMode="auto">
                     <a:xfrm>
                       <a:off x="0" y="0"/>
-                      <a:ext cx="5274310" cy="5645785"/>
+                      <a:ext cx="5274310" cy="5641975"/>
                     </a:xfrm>
                     <a:prstGeom prst="rect">
                       <a:avLst/>
@@ -12346,40 +12346,939 @@
         <w:t>4. Implementation Class Model</w:t>
       </w:r>
     </w:p>
-    <w:p/>
     <w:p>
       <w:pPr>
-        <w:pStyle w:val="1"/>
-      </w:pPr>
-      <w:r>
-        <w:t>5. Programming</w:t>
+        <w:pStyle w:val="2"/>
+      </w:pPr>
+      <w:r>
+        <w:rPr>
+          <w:rFonts w:hint="eastAsia"/>
+        </w:rPr>
+        <w:t>4.1 Implementation Class Diagram</w:t>
+      </w:r>
+    </w:p>
+    <w:p>
+      <w:pPr>
+        <w:jc w:val="center"/>
+      </w:pPr>
+      <w:r>
+        <w:rPr>
+          <w:noProof/>
+        </w:rPr>
+        <w:drawing>
+          <wp:inline distT="0" distB="0" distL="0" distR="0" wp14:anchorId="7E0261BB" wp14:editId="61520AD1">
+            <wp:extent cx="5274310" cy="4519295"/>
+            <wp:effectExtent l="0" t="0" r="2540" b="0"/>
+            <wp:docPr id="3" name="圖片 3"/>
+            <wp:cNvGraphicFramePr>
+              <a:graphicFrameLocks xmlns:a="http://schemas.openxmlformats.org/drawingml/2006/main" noChangeAspect="1"/>
+            </wp:cNvGraphicFramePr>
+            <a:graphic xmlns:a="http://schemas.openxmlformats.org/drawingml/2006/main">
+              <a:graphicData uri="http://schemas.openxmlformats.org/drawingml/2006/picture">
+                <pic:pic xmlns:pic="http://schemas.openxmlformats.org/drawingml/2006/picture">
+                  <pic:nvPicPr>
+                    <pic:cNvPr id="0" name="Picture 3"/>
+                    <pic:cNvPicPr>
+                      <a:picLocks noChangeAspect="1" noChangeArrowheads="1"/>
+                    </pic:cNvPicPr>
+                  </pic:nvPicPr>
+                  <pic:blipFill>
+                    <a:blip r:embed="rId23" cstate="print">
+                      <a:extLst>
+                        <a:ext uri="{28A0092B-C50C-407E-A947-70E740481C1C}">
+                          <a14:useLocalDpi xmlns:a14="http://schemas.microsoft.com/office/drawing/2010/main" val="0"/>
+                        </a:ext>
+                      </a:extLst>
+                    </a:blip>
+                    <a:srcRect/>
+                    <a:stretch>
+                      <a:fillRect/>
+                    </a:stretch>
+                  </pic:blipFill>
+                  <pic:spPr bwMode="auto">
+                    <a:xfrm>
+                      <a:off x="0" y="0"/>
+                      <a:ext cx="5274310" cy="4519295"/>
+                    </a:xfrm>
+                    <a:prstGeom prst="rect">
+                      <a:avLst/>
+                    </a:prstGeom>
+                    <a:noFill/>
+                    <a:ln>
+                      <a:noFill/>
+                    </a:ln>
+                  </pic:spPr>
+                </pic:pic>
+              </a:graphicData>
+            </a:graphic>
+          </wp:inline>
+        </w:drawing>
       </w:r>
     </w:p>
     <w:p/>
     <w:p>
       <w:pPr>
+        <w:jc w:val="center"/>
+        <w:rPr>
+          <w:rFonts w:ascii="Times New Roman" w:eastAsia="標楷體" w:hAnsi="Times New Roman" w:cs="Times New Roman"/>
+          <w:b/>
+          <w:bCs/>
+          <w:i/>
+          <w:iCs/>
+          <w:sz w:val="22"/>
+          <w:szCs w:val="22"/>
+        </w:rPr>
+      </w:pPr>
+      <w:r>
+        <w:rPr>
+          <w:rFonts w:ascii="Times New Roman" w:eastAsia="標楷體" w:hAnsi="Times New Roman" w:cs="Times New Roman" w:hint="eastAsia"/>
+          <w:b/>
+          <w:bCs/>
+          <w:i/>
+          <w:iCs/>
+          <w:sz w:val="22"/>
+          <w:szCs w:val="22"/>
+        </w:rPr>
+        <w:t xml:space="preserve">Figure </w:t>
+      </w:r>
+      <w:r>
+        <w:rPr>
+          <w:rFonts w:ascii="Times New Roman" w:eastAsia="標楷體" w:hAnsi="Times New Roman" w:cs="Times New Roman" w:hint="eastAsia"/>
+          <w:b/>
+          <w:bCs/>
+          <w:i/>
+          <w:iCs/>
+          <w:sz w:val="22"/>
+          <w:szCs w:val="22"/>
+        </w:rPr>
+        <w:t>4</w:t>
+      </w:r>
+      <w:r>
+        <w:rPr>
+          <w:rFonts w:ascii="Times New Roman" w:eastAsia="標楷體" w:hAnsi="Times New Roman" w:cs="Times New Roman" w:hint="eastAsia"/>
+          <w:b/>
+          <w:bCs/>
+          <w:i/>
+          <w:iCs/>
+          <w:sz w:val="22"/>
+          <w:szCs w:val="22"/>
+        </w:rPr>
+        <w:t>-</w:t>
+      </w:r>
+      <w:r>
+        <w:rPr>
+          <w:rFonts w:ascii="Times New Roman" w:eastAsia="標楷體" w:hAnsi="Times New Roman" w:cs="Times New Roman" w:hint="eastAsia"/>
+          <w:b/>
+          <w:bCs/>
+          <w:i/>
+          <w:iCs/>
+          <w:sz w:val="22"/>
+          <w:szCs w:val="22"/>
+        </w:rPr>
+        <w:t>1 Implementation Class Diagram</w:t>
+      </w:r>
+    </w:p>
+    <w:p/>
+    <w:p/>
+    <w:p/>
+    <w:p>
+      <w:pPr>
+        <w:rPr>
+          <w:rFonts w:hint="eastAsia"/>
+        </w:rPr>
+      </w:pPr>
+    </w:p>
+    <w:p>
+      <w:pPr>
         <w:pStyle w:val="2"/>
       </w:pPr>
       <w:r>
-        <w:t>5.1 Snapshots of system execution</w:t>
+        <w:rPr>
+          <w:rFonts w:hint="eastAsia"/>
+        </w:rPr>
+        <w:lastRenderedPageBreak/>
+        <w:t>4.2 The Difference between Implementation Class Model and Design Class Model</w:t>
+      </w:r>
+    </w:p>
+    <w:p>
+      <w:pPr>
+        <w:jc w:val="center"/>
+        <w:rPr>
+          <w:rFonts w:ascii="Times New Roman" w:hAnsi="Times New Roman" w:cs="Times New Roman"/>
+          <w:b/>
+          <w:bCs/>
+          <w:i/>
+          <w:iCs/>
+        </w:rPr>
+      </w:pPr>
+      <w:r>
+        <w:rPr>
+          <w:rFonts w:ascii="Times New Roman" w:hAnsi="Times New Roman" w:cs="Times New Roman"/>
+          <w:b/>
+          <w:bCs/>
+          <w:i/>
+          <w:iCs/>
+        </w:rPr>
+        <w:t xml:space="preserve">Table 4.2.1 </w:t>
+      </w:r>
+      <w:r>
+        <w:rPr>
+          <w:rFonts w:ascii="Times New Roman" w:hAnsi="Times New Roman" w:cs="Times New Roman"/>
+          <w:b/>
+          <w:bCs/>
+          <w:i/>
+          <w:iCs/>
+        </w:rPr>
+        <w:t>Comparison with design and implementation class</w:t>
+      </w:r>
+    </w:p>
+    <w:tbl>
+      <w:tblPr>
+        <w:tblStyle w:val="af2"/>
+        <w:tblW w:w="0" w:type="auto"/>
+        <w:tblLook w:val="04A0" w:firstRow="1" w:lastRow="0" w:firstColumn="1" w:lastColumn="0" w:noHBand="0" w:noVBand="1"/>
+      </w:tblPr>
+      <w:tblGrid>
+        <w:gridCol w:w="2074"/>
+        <w:gridCol w:w="2074"/>
+        <w:gridCol w:w="2074"/>
+        <w:gridCol w:w="2074"/>
+      </w:tblGrid>
+      <w:tr>
+        <w:tc>
+          <w:tcPr>
+            <w:tcW w:w="2074" w:type="dxa"/>
+          </w:tcPr>
+          <w:p>
+            <w:pPr>
+              <w:jc w:val="center"/>
+              <w:rPr>
+                <w:rFonts w:ascii="Times New Roman" w:hAnsi="Times New Roman" w:cs="Times New Roman"/>
+                <w:b/>
+                <w:bCs/>
+              </w:rPr>
+            </w:pPr>
+            <w:r>
+              <w:rPr>
+                <w:rFonts w:ascii="Times New Roman" w:hAnsi="Times New Roman" w:cs="Times New Roman"/>
+                <w:b/>
+                <w:bCs/>
+              </w:rPr>
+              <w:t>Class</w:t>
+            </w:r>
+          </w:p>
+        </w:tc>
+        <w:tc>
+          <w:tcPr>
+            <w:tcW w:w="2074" w:type="dxa"/>
+          </w:tcPr>
+          <w:p>
+            <w:pPr>
+              <w:jc w:val="center"/>
+              <w:rPr>
+                <w:rFonts w:ascii="Times New Roman" w:hAnsi="Times New Roman" w:cs="Times New Roman"/>
+                <w:b/>
+                <w:bCs/>
+              </w:rPr>
+            </w:pPr>
+            <w:r>
+              <w:rPr>
+                <w:rFonts w:ascii="Times New Roman" w:hAnsi="Times New Roman" w:cs="Times New Roman"/>
+                <w:b/>
+                <w:bCs/>
+              </w:rPr>
+              <w:t>Method</w:t>
+            </w:r>
+          </w:p>
+        </w:tc>
+        <w:tc>
+          <w:tcPr>
+            <w:tcW w:w="2074" w:type="dxa"/>
+          </w:tcPr>
+          <w:p>
+            <w:pPr>
+              <w:jc w:val="center"/>
+              <w:rPr>
+                <w:rFonts w:ascii="Times New Roman" w:hAnsi="Times New Roman" w:cs="Times New Roman"/>
+                <w:b/>
+                <w:bCs/>
+              </w:rPr>
+            </w:pPr>
+            <w:r>
+              <w:rPr>
+                <w:rFonts w:ascii="Times New Roman" w:hAnsi="Times New Roman" w:cs="Times New Roman"/>
+                <w:b/>
+                <w:bCs/>
+              </w:rPr>
+              <w:t>Design</w:t>
+            </w:r>
+          </w:p>
+        </w:tc>
+        <w:tc>
+          <w:tcPr>
+            <w:tcW w:w="2074" w:type="dxa"/>
+          </w:tcPr>
+          <w:p>
+            <w:pPr>
+              <w:jc w:val="center"/>
+              <w:rPr>
+                <w:rFonts w:ascii="Times New Roman" w:hAnsi="Times New Roman" w:cs="Times New Roman"/>
+                <w:b/>
+                <w:bCs/>
+              </w:rPr>
+            </w:pPr>
+            <w:r>
+              <w:rPr>
+                <w:rFonts w:ascii="Times New Roman" w:hAnsi="Times New Roman" w:cs="Times New Roman"/>
+                <w:b/>
+                <w:bCs/>
+              </w:rPr>
+              <w:t>Imp.</w:t>
+            </w:r>
+          </w:p>
+        </w:tc>
+      </w:tr>
+      <w:tr>
+        <w:tc>
+          <w:tcPr>
+            <w:tcW w:w="2074" w:type="dxa"/>
+            <w:vMerge w:val="restart"/>
+          </w:tcPr>
+          <w:p>
+            <w:pPr>
+              <w:rPr>
+                <w:rFonts w:ascii="Times New Roman" w:hAnsi="Times New Roman" w:cs="Times New Roman"/>
+              </w:rPr>
+            </w:pPr>
+            <w:r>
+              <w:rPr>
+                <w:rFonts w:ascii="Times New Roman" w:hAnsi="Times New Roman" w:cs="Times New Roman"/>
+              </w:rPr>
+              <w:t>Book</w:t>
+            </w:r>
+          </w:p>
+        </w:tc>
+        <w:tc>
+          <w:tcPr>
+            <w:tcW w:w="2074" w:type="dxa"/>
+          </w:tcPr>
+          <w:p>
+            <w:pPr>
+              <w:rPr>
+                <w:rFonts w:ascii="Times New Roman" w:hAnsi="Times New Roman" w:cs="Times New Roman"/>
+              </w:rPr>
+            </w:pPr>
+            <w:r>
+              <w:rPr>
+                <w:rFonts w:ascii="Times New Roman" w:hAnsi="Times New Roman" w:cs="Times New Roman"/>
+              </w:rPr>
+              <w:t>create</w:t>
+            </w:r>
+          </w:p>
+        </w:tc>
+        <w:tc>
+          <w:tcPr>
+            <w:tcW w:w="2074" w:type="dxa"/>
+          </w:tcPr>
+          <w:p>
+            <w:pPr>
+              <w:jc w:val="center"/>
+              <w:rPr>
+                <w:rFonts w:ascii="Times New Roman" w:hAnsi="Times New Roman" w:cs="Times New Roman"/>
+                <w:i/>
+                <w:iCs/>
+              </w:rPr>
+            </w:pPr>
+            <w:r>
+              <w:rPr>
+                <w:rFonts w:ascii="Times New Roman" w:hAnsi="Times New Roman" w:cs="Times New Roman"/>
+                <w:i/>
+                <w:iCs/>
+              </w:rPr>
+              <w:t>Yes</w:t>
+            </w:r>
+          </w:p>
+        </w:tc>
+        <w:tc>
+          <w:tcPr>
+            <w:tcW w:w="2074" w:type="dxa"/>
+          </w:tcPr>
+          <w:p>
+            <w:pPr>
+              <w:jc w:val="center"/>
+              <w:rPr>
+                <w:rFonts w:ascii="Times New Roman" w:hAnsi="Times New Roman" w:cs="Times New Roman"/>
+                <w:i/>
+                <w:iCs/>
+              </w:rPr>
+            </w:pPr>
+          </w:p>
+        </w:tc>
+      </w:tr>
+      <w:tr>
+        <w:tc>
+          <w:tcPr>
+            <w:tcW w:w="2074" w:type="dxa"/>
+            <w:vMerge/>
+          </w:tcPr>
+          <w:p>
+            <w:pPr>
+              <w:rPr>
+                <w:rFonts w:ascii="Times New Roman" w:hAnsi="Times New Roman" w:cs="Times New Roman"/>
+              </w:rPr>
+            </w:pPr>
+          </w:p>
+        </w:tc>
+        <w:tc>
+          <w:tcPr>
+            <w:tcW w:w="2074" w:type="dxa"/>
+          </w:tcPr>
+          <w:p>
+            <w:pPr>
+              <w:rPr>
+                <w:rFonts w:ascii="Times New Roman" w:hAnsi="Times New Roman" w:cs="Times New Roman"/>
+              </w:rPr>
+            </w:pPr>
+            <w:proofErr w:type="spellStart"/>
+            <w:r>
+              <w:rPr>
+                <w:rFonts w:ascii="Times New Roman" w:hAnsi="Times New Roman" w:cs="Times New Roman"/>
+              </w:rPr>
+              <w:t>updateInfo</w:t>
+            </w:r>
+            <w:proofErr w:type="spellEnd"/>
+          </w:p>
+        </w:tc>
+        <w:tc>
+          <w:tcPr>
+            <w:tcW w:w="2074" w:type="dxa"/>
+          </w:tcPr>
+          <w:p>
+            <w:pPr>
+              <w:jc w:val="center"/>
+              <w:rPr>
+                <w:rFonts w:ascii="Times New Roman" w:hAnsi="Times New Roman" w:cs="Times New Roman"/>
+                <w:i/>
+                <w:iCs/>
+              </w:rPr>
+            </w:pPr>
+            <w:r>
+              <w:rPr>
+                <w:rFonts w:ascii="Times New Roman" w:hAnsi="Times New Roman" w:cs="Times New Roman"/>
+                <w:i/>
+                <w:iCs/>
+              </w:rPr>
+              <w:t>Yes</w:t>
+            </w:r>
+          </w:p>
+        </w:tc>
+        <w:tc>
+          <w:tcPr>
+            <w:tcW w:w="2074" w:type="dxa"/>
+          </w:tcPr>
+          <w:p>
+            <w:pPr>
+              <w:jc w:val="center"/>
+              <w:rPr>
+                <w:rFonts w:ascii="Times New Roman" w:hAnsi="Times New Roman" w:cs="Times New Roman"/>
+                <w:i/>
+                <w:iCs/>
+              </w:rPr>
+            </w:pPr>
+          </w:p>
+        </w:tc>
+      </w:tr>
+      <w:tr>
+        <w:tc>
+          <w:tcPr>
+            <w:tcW w:w="2074" w:type="dxa"/>
+            <w:vMerge/>
+          </w:tcPr>
+          <w:p>
+            <w:pPr>
+              <w:rPr>
+                <w:rFonts w:ascii="Times New Roman" w:hAnsi="Times New Roman" w:cs="Times New Roman"/>
+              </w:rPr>
+            </w:pPr>
+          </w:p>
+        </w:tc>
+        <w:tc>
+          <w:tcPr>
+            <w:tcW w:w="2074" w:type="dxa"/>
+          </w:tcPr>
+          <w:p>
+            <w:pPr>
+              <w:rPr>
+                <w:rFonts w:ascii="Times New Roman" w:hAnsi="Times New Roman" w:cs="Times New Roman"/>
+              </w:rPr>
+            </w:pPr>
+            <w:r>
+              <w:rPr>
+                <w:rFonts w:ascii="Times New Roman" w:hAnsi="Times New Roman" w:cs="Times New Roman"/>
+              </w:rPr>
+              <w:t>destroy</w:t>
+            </w:r>
+          </w:p>
+        </w:tc>
+        <w:tc>
+          <w:tcPr>
+            <w:tcW w:w="2074" w:type="dxa"/>
+          </w:tcPr>
+          <w:p>
+            <w:pPr>
+              <w:jc w:val="center"/>
+              <w:rPr>
+                <w:rFonts w:ascii="Times New Roman" w:hAnsi="Times New Roman" w:cs="Times New Roman"/>
+                <w:i/>
+                <w:iCs/>
+              </w:rPr>
+            </w:pPr>
+            <w:r>
+              <w:rPr>
+                <w:rFonts w:ascii="Times New Roman" w:hAnsi="Times New Roman" w:cs="Times New Roman"/>
+                <w:i/>
+                <w:iCs/>
+              </w:rPr>
+              <w:t>Yes</w:t>
+            </w:r>
+          </w:p>
+        </w:tc>
+        <w:tc>
+          <w:tcPr>
+            <w:tcW w:w="2074" w:type="dxa"/>
+          </w:tcPr>
+          <w:p>
+            <w:pPr>
+              <w:jc w:val="center"/>
+              <w:rPr>
+                <w:rFonts w:ascii="Times New Roman" w:hAnsi="Times New Roman" w:cs="Times New Roman"/>
+                <w:i/>
+                <w:iCs/>
+              </w:rPr>
+            </w:pPr>
+          </w:p>
+        </w:tc>
+      </w:tr>
+      <w:tr>
+        <w:tc>
+          <w:tcPr>
+            <w:tcW w:w="2074" w:type="dxa"/>
+            <w:vMerge/>
+          </w:tcPr>
+          <w:p>
+            <w:pPr>
+              <w:rPr>
+                <w:rFonts w:ascii="Times New Roman" w:hAnsi="Times New Roman" w:cs="Times New Roman"/>
+              </w:rPr>
+            </w:pPr>
+          </w:p>
+        </w:tc>
+        <w:tc>
+          <w:tcPr>
+            <w:tcW w:w="2074" w:type="dxa"/>
+          </w:tcPr>
+          <w:p>
+            <w:pPr>
+              <w:rPr>
+                <w:rFonts w:ascii="Times New Roman" w:hAnsi="Times New Roman" w:cs="Times New Roman"/>
+              </w:rPr>
+            </w:pPr>
+            <w:proofErr w:type="spellStart"/>
+            <w:r>
+              <w:rPr>
+                <w:rFonts w:ascii="Times New Roman" w:hAnsi="Times New Roman" w:cs="Times New Roman"/>
+              </w:rPr>
+              <w:t>updateCategory</w:t>
+            </w:r>
+            <w:proofErr w:type="spellEnd"/>
+          </w:p>
+        </w:tc>
+        <w:tc>
+          <w:tcPr>
+            <w:tcW w:w="2074" w:type="dxa"/>
+          </w:tcPr>
+          <w:p>
+            <w:pPr>
+              <w:jc w:val="center"/>
+              <w:rPr>
+                <w:rFonts w:ascii="Times New Roman" w:hAnsi="Times New Roman" w:cs="Times New Roman"/>
+                <w:i/>
+                <w:iCs/>
+              </w:rPr>
+            </w:pPr>
+            <w:r>
+              <w:rPr>
+                <w:rFonts w:ascii="Times New Roman" w:hAnsi="Times New Roman" w:cs="Times New Roman"/>
+                <w:i/>
+                <w:iCs/>
+              </w:rPr>
+              <w:t>Yes</w:t>
+            </w:r>
+          </w:p>
+        </w:tc>
+        <w:tc>
+          <w:tcPr>
+            <w:tcW w:w="2074" w:type="dxa"/>
+          </w:tcPr>
+          <w:p>
+            <w:pPr>
+              <w:jc w:val="center"/>
+              <w:rPr>
+                <w:rFonts w:ascii="Times New Roman" w:hAnsi="Times New Roman" w:cs="Times New Roman"/>
+                <w:i/>
+                <w:iCs/>
+              </w:rPr>
+            </w:pPr>
+          </w:p>
+        </w:tc>
+      </w:tr>
+      <w:tr>
+        <w:tc>
+          <w:tcPr>
+            <w:tcW w:w="2074" w:type="dxa"/>
+            <w:vMerge/>
+          </w:tcPr>
+          <w:p>
+            <w:pPr>
+              <w:rPr>
+                <w:rFonts w:ascii="Times New Roman" w:hAnsi="Times New Roman" w:cs="Times New Roman"/>
+              </w:rPr>
+            </w:pPr>
+          </w:p>
+        </w:tc>
+        <w:tc>
+          <w:tcPr>
+            <w:tcW w:w="2074" w:type="dxa"/>
+          </w:tcPr>
+          <w:p>
+            <w:pPr>
+              <w:rPr>
+                <w:rFonts w:ascii="Times New Roman" w:hAnsi="Times New Roman" w:cs="Times New Roman"/>
+              </w:rPr>
+            </w:pPr>
+            <w:proofErr w:type="spellStart"/>
+            <w:r>
+              <w:rPr>
+                <w:rFonts w:ascii="Times New Roman" w:hAnsi="Times New Roman" w:cs="Times New Roman"/>
+              </w:rPr>
+              <w:t>getStatus</w:t>
+            </w:r>
+            <w:proofErr w:type="spellEnd"/>
+          </w:p>
+        </w:tc>
+        <w:tc>
+          <w:tcPr>
+            <w:tcW w:w="2074" w:type="dxa"/>
+          </w:tcPr>
+          <w:p>
+            <w:pPr>
+              <w:jc w:val="center"/>
+              <w:rPr>
+                <w:rFonts w:ascii="Times New Roman" w:hAnsi="Times New Roman" w:cs="Times New Roman"/>
+                <w:i/>
+                <w:iCs/>
+              </w:rPr>
+            </w:pPr>
+            <w:r>
+              <w:rPr>
+                <w:rFonts w:ascii="Times New Roman" w:hAnsi="Times New Roman" w:cs="Times New Roman"/>
+                <w:i/>
+                <w:iCs/>
+              </w:rPr>
+              <w:t>Yes</w:t>
+            </w:r>
+          </w:p>
+        </w:tc>
+        <w:tc>
+          <w:tcPr>
+            <w:tcW w:w="2074" w:type="dxa"/>
+          </w:tcPr>
+          <w:p>
+            <w:pPr>
+              <w:jc w:val="center"/>
+              <w:rPr>
+                <w:rFonts w:ascii="Times New Roman" w:hAnsi="Times New Roman" w:cs="Times New Roman"/>
+                <w:i/>
+                <w:iCs/>
+              </w:rPr>
+            </w:pPr>
+          </w:p>
+        </w:tc>
+      </w:tr>
+      <w:tr>
+        <w:tc>
+          <w:tcPr>
+            <w:tcW w:w="2074" w:type="dxa"/>
+            <w:vMerge/>
+          </w:tcPr>
+          <w:p>
+            <w:pPr>
+              <w:rPr>
+                <w:rFonts w:ascii="Times New Roman" w:hAnsi="Times New Roman" w:cs="Times New Roman"/>
+              </w:rPr>
+            </w:pPr>
+          </w:p>
+        </w:tc>
+        <w:tc>
+          <w:tcPr>
+            <w:tcW w:w="2074" w:type="dxa"/>
+          </w:tcPr>
+          <w:p>
+            <w:pPr>
+              <w:rPr>
+                <w:rFonts w:ascii="Times New Roman" w:hAnsi="Times New Roman" w:cs="Times New Roman"/>
+              </w:rPr>
+            </w:pPr>
+            <w:proofErr w:type="spellStart"/>
+            <w:r>
+              <w:rPr>
+                <w:rFonts w:ascii="Times New Roman" w:hAnsi="Times New Roman" w:cs="Times New Roman"/>
+              </w:rPr>
+              <w:t>updateStatus</w:t>
+            </w:r>
+            <w:proofErr w:type="spellEnd"/>
+          </w:p>
+        </w:tc>
+        <w:tc>
+          <w:tcPr>
+            <w:tcW w:w="2074" w:type="dxa"/>
+          </w:tcPr>
+          <w:p>
+            <w:pPr>
+              <w:jc w:val="center"/>
+              <w:rPr>
+                <w:rFonts w:ascii="Times New Roman" w:hAnsi="Times New Roman" w:cs="Times New Roman"/>
+                <w:i/>
+                <w:iCs/>
+              </w:rPr>
+            </w:pPr>
+            <w:r>
+              <w:rPr>
+                <w:rFonts w:ascii="Times New Roman" w:hAnsi="Times New Roman" w:cs="Times New Roman"/>
+                <w:i/>
+                <w:iCs/>
+              </w:rPr>
+              <w:t>Yes</w:t>
+            </w:r>
+          </w:p>
+        </w:tc>
+        <w:tc>
+          <w:tcPr>
+            <w:tcW w:w="2074" w:type="dxa"/>
+          </w:tcPr>
+          <w:p>
+            <w:pPr>
+              <w:jc w:val="center"/>
+              <w:rPr>
+                <w:rFonts w:ascii="Times New Roman" w:hAnsi="Times New Roman" w:cs="Times New Roman"/>
+                <w:i/>
+                <w:iCs/>
+              </w:rPr>
+            </w:pPr>
+            <w:r>
+              <w:rPr>
+                <w:rFonts w:ascii="Times New Roman" w:hAnsi="Times New Roman" w:cs="Times New Roman"/>
+                <w:i/>
+                <w:iCs/>
+              </w:rPr>
+              <w:t>Yes</w:t>
+            </w:r>
+          </w:p>
+        </w:tc>
+      </w:tr>
+      <w:tr>
+        <w:tc>
+          <w:tcPr>
+            <w:tcW w:w="2074" w:type="dxa"/>
+            <w:vMerge w:val="restart"/>
+          </w:tcPr>
+          <w:p>
+            <w:pPr>
+              <w:rPr>
+                <w:rFonts w:ascii="Times New Roman" w:hAnsi="Times New Roman" w:cs="Times New Roman"/>
+              </w:rPr>
+            </w:pPr>
+            <w:proofErr w:type="spellStart"/>
+            <w:r>
+              <w:rPr>
+                <w:rFonts w:ascii="Times New Roman" w:hAnsi="Times New Roman" w:cs="Times New Roman"/>
+              </w:rPr>
+              <w:t>BookRepository</w:t>
+            </w:r>
+            <w:proofErr w:type="spellEnd"/>
+          </w:p>
+        </w:tc>
+        <w:tc>
+          <w:tcPr>
+            <w:tcW w:w="2074" w:type="dxa"/>
+          </w:tcPr>
+          <w:p>
+            <w:pPr>
+              <w:rPr>
+                <w:rFonts w:ascii="Times New Roman" w:hAnsi="Times New Roman" w:cs="Times New Roman"/>
+              </w:rPr>
+            </w:pPr>
+            <w:proofErr w:type="spellStart"/>
+            <w:r>
+              <w:rPr>
+                <w:rFonts w:ascii="Times New Roman" w:hAnsi="Times New Roman" w:cs="Times New Roman"/>
+              </w:rPr>
+              <w:t>findBooks</w:t>
+            </w:r>
+            <w:proofErr w:type="spellEnd"/>
+          </w:p>
+        </w:tc>
+        <w:tc>
+          <w:tcPr>
+            <w:tcW w:w="2074" w:type="dxa"/>
+          </w:tcPr>
+          <w:p>
+            <w:pPr>
+              <w:jc w:val="center"/>
+              <w:rPr>
+                <w:rFonts w:ascii="Times New Roman" w:hAnsi="Times New Roman" w:cs="Times New Roman"/>
+                <w:i/>
+                <w:iCs/>
+              </w:rPr>
+            </w:pPr>
+            <w:r>
+              <w:rPr>
+                <w:rFonts w:ascii="Times New Roman" w:hAnsi="Times New Roman" w:cs="Times New Roman"/>
+                <w:i/>
+                <w:iCs/>
+              </w:rPr>
+              <w:t>Yes</w:t>
+            </w:r>
+          </w:p>
+        </w:tc>
+        <w:tc>
+          <w:tcPr>
+            <w:tcW w:w="2074" w:type="dxa"/>
+          </w:tcPr>
+          <w:p>
+            <w:pPr>
+              <w:jc w:val="center"/>
+              <w:rPr>
+                <w:rFonts w:ascii="Times New Roman" w:hAnsi="Times New Roman" w:cs="Times New Roman"/>
+                <w:i/>
+                <w:iCs/>
+              </w:rPr>
+            </w:pPr>
+            <w:r>
+              <w:rPr>
+                <w:rFonts w:ascii="Times New Roman" w:hAnsi="Times New Roman" w:cs="Times New Roman"/>
+                <w:i/>
+                <w:iCs/>
+              </w:rPr>
+              <w:t>Yes</w:t>
+            </w:r>
+          </w:p>
+        </w:tc>
+      </w:tr>
+      <w:tr>
+        <w:tc>
+          <w:tcPr>
+            <w:tcW w:w="2074" w:type="dxa"/>
+            <w:vMerge/>
+          </w:tcPr>
+          <w:p/>
+        </w:tc>
+        <w:tc>
+          <w:tcPr>
+            <w:tcW w:w="2074" w:type="dxa"/>
+          </w:tcPr>
+          <w:p>
+            <w:pPr>
+              <w:rPr>
+                <w:rFonts w:ascii="Times New Roman" w:hAnsi="Times New Roman" w:cs="Times New Roman"/>
+              </w:rPr>
+            </w:pPr>
+            <w:proofErr w:type="spellStart"/>
+            <w:r>
+              <w:rPr>
+                <w:rFonts w:ascii="Times New Roman" w:hAnsi="Times New Roman" w:cs="Times New Roman"/>
+              </w:rPr>
+              <w:t>getDetails</w:t>
+            </w:r>
+            <w:proofErr w:type="spellEnd"/>
+          </w:p>
+        </w:tc>
+        <w:tc>
+          <w:tcPr>
+            <w:tcW w:w="2074" w:type="dxa"/>
+          </w:tcPr>
+          <w:p>
+            <w:pPr>
+              <w:jc w:val="center"/>
+              <w:rPr>
+                <w:rFonts w:ascii="Times New Roman" w:hAnsi="Times New Roman" w:cs="Times New Roman"/>
+                <w:i/>
+                <w:iCs/>
+              </w:rPr>
+            </w:pPr>
+            <w:r>
+              <w:rPr>
+                <w:rFonts w:ascii="Times New Roman" w:hAnsi="Times New Roman" w:cs="Times New Roman"/>
+                <w:i/>
+                <w:iCs/>
+              </w:rPr>
+              <w:t>Yes</w:t>
+            </w:r>
+          </w:p>
+        </w:tc>
+        <w:tc>
+          <w:tcPr>
+            <w:tcW w:w="2074" w:type="dxa"/>
+          </w:tcPr>
+          <w:p>
+            <w:pPr>
+              <w:jc w:val="center"/>
+              <w:rPr>
+                <w:rFonts w:ascii="Times New Roman" w:hAnsi="Times New Roman" w:cs="Times New Roman"/>
+                <w:i/>
+                <w:iCs/>
+              </w:rPr>
+            </w:pPr>
+            <w:r>
+              <w:rPr>
+                <w:rFonts w:ascii="Times New Roman" w:hAnsi="Times New Roman" w:cs="Times New Roman"/>
+                <w:i/>
+                <w:iCs/>
+              </w:rPr>
+              <w:t>No</w:t>
+            </w:r>
+          </w:p>
+        </w:tc>
+      </w:tr>
+    </w:tbl>
+    <w:p/>
+    <w:p>
+      <w:pPr>
+        <w:pStyle w:val="2"/>
+      </w:pPr>
+      <w:r>
+        <w:rPr>
+          <w:rFonts w:hint="eastAsia"/>
+        </w:rPr>
+        <w:t>4.3 Line of Code</w:t>
       </w:r>
     </w:p>
     <w:p/>
     <w:p>
       <w:pPr>
-        <w:pStyle w:val="2"/>
-      </w:pPr>
-      <w:r>
-        <w:t>5.2 Source Code Listing</w:t>
+        <w:pStyle w:val="1"/>
+      </w:pPr>
+      <w:r>
+        <w:t>5. Programming</w:t>
       </w:r>
     </w:p>
     <w:p/>
     <w:p>
       <w:pPr>
-        <w:pStyle w:val="1"/>
-      </w:pPr>
-      <w:r>
-        <w:t>6. Unit Testing</w:t>
+        <w:pStyle w:val="2"/>
+      </w:pPr>
+      <w:r>
+        <w:t>5.1 Snapshots of system execution</w:t>
       </w:r>
     </w:p>
     <w:p/>
@@ -12388,6 +13287,25 @@
         <w:pStyle w:val="2"/>
       </w:pPr>
       <w:r>
+        <w:t>5.2 Source Code Listing</w:t>
+      </w:r>
+    </w:p>
+    <w:p/>
+    <w:p>
+      <w:pPr>
+        <w:pStyle w:val="1"/>
+      </w:pPr>
+      <w:r>
+        <w:t>6. Unit Testing</w:t>
+      </w:r>
+    </w:p>
+    <w:p/>
+    <w:p>
+      <w:pPr>
+        <w:pStyle w:val="2"/>
+      </w:pPr>
+      <w:r>
+        <w:lastRenderedPageBreak/>
         <w:t>6.1 Snapshots of testing result</w:t>
       </w:r>
     </w:p>
@@ -13482,6 +14400,201 @@
                 <w:rFonts w:ascii="Times New Roman" w:eastAsia="標楷體" w:hAnsi="Times New Roman" w:cs="Times New Roman"/>
               </w:rPr>
               <w:t>2h</w:t>
+            </w:r>
+          </w:p>
+        </w:tc>
+        <w:tc>
+          <w:tcPr>
+            <w:tcW w:w="1189" w:type="dxa"/>
+          </w:tcPr>
+          <w:p>
+            <w:pPr>
+              <w:rPr>
+                <w:rFonts w:ascii="Times New Roman" w:eastAsia="標楷體" w:hAnsi="Times New Roman" w:cs="Times New Roman"/>
+              </w:rPr>
+            </w:pPr>
+          </w:p>
+        </w:tc>
+      </w:tr>
+      <w:tr>
+        <w:trPr>
+          <w:trHeight w:val="336"/>
+        </w:trPr>
+        <w:tc>
+          <w:tcPr>
+            <w:tcW w:w="1877" w:type="dxa"/>
+          </w:tcPr>
+          <w:p>
+            <w:pPr>
+              <w:rPr>
+                <w:rFonts w:ascii="Times New Roman" w:eastAsia="標楷體" w:hAnsi="Times New Roman" w:cs="Times New Roman"/>
+              </w:rPr>
+            </w:pPr>
+          </w:p>
+        </w:tc>
+        <w:tc>
+          <w:tcPr>
+            <w:tcW w:w="3829" w:type="dxa"/>
+          </w:tcPr>
+          <w:p>
+            <w:pPr>
+              <w:rPr>
+                <w:rFonts w:ascii="Times New Roman" w:eastAsia="標楷體" w:hAnsi="Times New Roman" w:cs="Times New Roman"/>
+              </w:rPr>
+            </w:pPr>
+            <w:r>
+              <w:rPr>
+                <w:rFonts w:ascii="Times New Roman" w:eastAsia="標楷體" w:hAnsi="Times New Roman" w:cs="Times New Roman" w:hint="eastAsia"/>
+              </w:rPr>
+              <w:t>26/04/30 20:00~22:00</w:t>
+            </w:r>
+          </w:p>
+        </w:tc>
+        <w:tc>
+          <w:tcPr>
+            <w:tcW w:w="1350" w:type="dxa"/>
+          </w:tcPr>
+          <w:p>
+            <w:pPr>
+              <w:rPr>
+                <w:rFonts w:ascii="Times New Roman" w:eastAsia="標楷體" w:hAnsi="Times New Roman" w:cs="Times New Roman"/>
+              </w:rPr>
+            </w:pPr>
+            <w:r>
+              <w:rPr>
+                <w:rFonts w:ascii="Times New Roman" w:eastAsia="標楷體" w:hAnsi="Times New Roman" w:cs="Times New Roman" w:hint="eastAsia"/>
+              </w:rPr>
+              <w:t>2h</w:t>
+            </w:r>
+          </w:p>
+        </w:tc>
+        <w:tc>
+          <w:tcPr>
+            <w:tcW w:w="1189" w:type="dxa"/>
+          </w:tcPr>
+          <w:p>
+            <w:pPr>
+              <w:rPr>
+                <w:rFonts w:ascii="Times New Roman" w:eastAsia="標楷體" w:hAnsi="Times New Roman" w:cs="Times New Roman"/>
+              </w:rPr>
+            </w:pPr>
+          </w:p>
+        </w:tc>
+      </w:tr>
+      <w:tr>
+        <w:trPr>
+          <w:trHeight w:val="336"/>
+        </w:trPr>
+        <w:tc>
+          <w:tcPr>
+            <w:tcW w:w="1877" w:type="dxa"/>
+          </w:tcPr>
+          <w:p>
+            <w:pPr>
+              <w:rPr>
+                <w:rFonts w:ascii="Times New Roman" w:eastAsia="標楷體" w:hAnsi="Times New Roman" w:cs="Times New Roman"/>
+              </w:rPr>
+            </w:pPr>
+          </w:p>
+        </w:tc>
+        <w:tc>
+          <w:tcPr>
+            <w:tcW w:w="3829" w:type="dxa"/>
+          </w:tcPr>
+          <w:p>
+            <w:pPr>
+              <w:rPr>
+                <w:rFonts w:ascii="Times New Roman" w:eastAsia="標楷體" w:hAnsi="Times New Roman" w:cs="Times New Roman"/>
+              </w:rPr>
+            </w:pPr>
+            <w:r>
+              <w:rPr>
+                <w:rFonts w:ascii="Times New Roman" w:eastAsia="標楷體" w:hAnsi="Times New Roman" w:cs="Times New Roman" w:hint="eastAsia"/>
+              </w:rPr>
+              <w:t>26/05/01 22:00~23:59</w:t>
+            </w:r>
+          </w:p>
+        </w:tc>
+        <w:tc>
+          <w:tcPr>
+            <w:tcW w:w="1350" w:type="dxa"/>
+          </w:tcPr>
+          <w:p>
+            <w:pPr>
+              <w:rPr>
+                <w:rFonts w:ascii="Times New Roman" w:eastAsia="標楷體" w:hAnsi="Times New Roman" w:cs="Times New Roman"/>
+              </w:rPr>
+            </w:pPr>
+            <w:r>
+              <w:rPr>
+                <w:rFonts w:ascii="Times New Roman" w:eastAsia="標楷體" w:hAnsi="Times New Roman" w:cs="Times New Roman" w:hint="eastAsia"/>
+              </w:rPr>
+              <w:t>1h</w:t>
+            </w:r>
+          </w:p>
+        </w:tc>
+        <w:tc>
+          <w:tcPr>
+            <w:tcW w:w="1189" w:type="dxa"/>
+          </w:tcPr>
+          <w:p>
+            <w:pPr>
+              <w:rPr>
+                <w:rFonts w:ascii="Times New Roman" w:eastAsia="標楷體" w:hAnsi="Times New Roman" w:cs="Times New Roman"/>
+              </w:rPr>
+            </w:pPr>
+          </w:p>
+        </w:tc>
+      </w:tr>
+      <w:tr>
+        <w:trPr>
+          <w:trHeight w:val="336"/>
+        </w:trPr>
+        <w:tc>
+          <w:tcPr>
+            <w:tcW w:w="1877" w:type="dxa"/>
+          </w:tcPr>
+          <w:p>
+            <w:pPr>
+              <w:rPr>
+                <w:rFonts w:ascii="Times New Roman" w:eastAsia="標楷體" w:hAnsi="Times New Roman" w:cs="Times New Roman"/>
+              </w:rPr>
+            </w:pPr>
+          </w:p>
+        </w:tc>
+        <w:tc>
+          <w:tcPr>
+            <w:tcW w:w="3829" w:type="dxa"/>
+          </w:tcPr>
+          <w:p>
+            <w:pPr>
+              <w:rPr>
+                <w:rFonts w:ascii="Times New Roman" w:eastAsia="標楷體" w:hAnsi="Times New Roman" w:cs="Times New Roman"/>
+              </w:rPr>
+            </w:pPr>
+            <w:r>
+              <w:rPr>
+                <w:rFonts w:ascii="Times New Roman" w:eastAsia="標楷體" w:hAnsi="Times New Roman" w:cs="Times New Roman" w:hint="eastAsia"/>
+              </w:rPr>
+              <w:t>26/05/02 00:00~03:00</w:t>
+            </w:r>
+          </w:p>
+        </w:tc>
+        <w:tc>
+          <w:tcPr>
+            <w:tcW w:w="1350" w:type="dxa"/>
+          </w:tcPr>
+          <w:p>
+            <w:pPr>
+              <w:rPr>
+                <w:rFonts w:ascii="Times New Roman" w:eastAsia="標楷體" w:hAnsi="Times New Roman" w:cs="Times New Roman"/>
+              </w:rPr>
+            </w:pPr>
+            <w:r>
+              <w:rPr>
+                <w:rFonts w:ascii="Times New Roman" w:eastAsia="標楷體" w:hAnsi="Times New Roman" w:cs="Times New Roman" w:hint="eastAsia"/>
+              </w:rPr>
+              <w:t>3h</w:t>
             </w:r>
           </w:p>
         </w:tc>
@@ -15421,7 +16534,7 @@
   <w:style w:type="paragraph" w:default="1" w:styleId="a">
     <w:name w:val="Normal"/>
     <w:qFormat/>
-    <w:rsid w:val="0048387E"/>
+    <w:rsid w:val="002E3A7C"/>
     <w:pPr>
       <w:widowControl w:val="0"/>
     </w:pPr>

</xml_diff>